<commit_message>
More of telemetrical ui and feature changes enhancing improvement of user accessibility
</commit_message>
<xml_diff>
--- a/docs/ApexAI_Project_Record.docx
+++ b/docs/ApexAI_Project_Record.docx
@@ -15,7 +15,7 @@
     </w:p>
     <w:p>
       <w:r>
-        <w:t xml:space="preserve">Last updated: 2026-05-10</w:t>
+        <w:t xml:space="preserve">Last updated: 2026-05-19</w:t>
       </w:r>
     </w:p>
     <w:p>
@@ -713,6 +713,505 @@
     <w:p>
       <w:r>
         <w:t xml:space="preserve">• `frontend/src/components/telemetry-side-panel.tsx`</w:t>
+      </w:r>
+    </w:p>
+    <w:p>
+      <w:r/>
+    </w:p>
+    <w:p>
+      <w:r>
+        <w:t xml:space="preserve">Verification for this pass:</w:t>
+      </w:r>
+    </w:p>
+    <w:p>
+      <w:r/>
+    </w:p>
+    <w:p>
+      <w:r>
+        <w:t xml:space="preserve">• backend tests: `21 passed`</w:t>
+      </w:r>
+    </w:p>
+    <w:p>
+      <w:r>
+        <w:t xml:space="preserve">• frontend production build: passed</w:t>
+      </w:r>
+    </w:p>
+    <w:p>
+      <w:r/>
+    </w:p>
+    <w:p>
+      <w:pPr>
+        <w:pStyle w:val="Heading3"/>
+      </w:pPr>
+      <w:r>
+        <w:t xml:space="preserve">Phase 20: Telemetry Interaction Pass</w:t>
+      </w:r>
+    </w:p>
+    <w:p>
+      <w:r/>
+    </w:p>
+    <w:p>
+      <w:r>
+        <w:t xml:space="preserve">• Rebuilt the main telemetry chart component and the delta chart component to support direct drag-to-zoom interaction on the plots themselves.</w:t>
+      </w:r>
+    </w:p>
+    <w:p>
+      <w:r>
+        <w:t xml:space="preserve">• The shared inspection window can now be created by dragging across any telemetry chart or the delta chart, and double-clicking resets the focused window.</w:t>
+      </w:r>
+    </w:p>
+    <w:p>
+      <w:r>
+        <w:t xml:space="preserve">• Wired those chart interactions back into the dashboard-level distance window state so every telemetry panel stays synchronized.</w:t>
+      </w:r>
+    </w:p>
+    <w:p>
+      <w:r>
+        <w:t xml:space="preserve">• Expanded same-driver overlay review in the side rail with average lap, set spread, and best consistency summaries, which makes multi-lap same-driver analysis much more useful.</w:t>
+      </w:r>
+    </w:p>
+    <w:p>
+      <w:r/>
+    </w:p>
+    <w:p>
+      <w:r>
+        <w:t xml:space="preserve">Technical files changed in this pass:</w:t>
+      </w:r>
+    </w:p>
+    <w:p>
+      <w:r/>
+    </w:p>
+    <w:p>
+      <w:r>
+        <w:t xml:space="preserve">• `frontend/src/components/telemetry-chart.tsx`</w:t>
+      </w:r>
+    </w:p>
+    <w:p>
+      <w:r>
+        <w:t xml:space="preserve">• `frontend/src/components/telemetry-delta-chart.tsx`</w:t>
+      </w:r>
+    </w:p>
+    <w:p>
+      <w:r>
+        <w:t xml:space="preserve">• `frontend/src/app/dashboard/page.tsx`</w:t>
+      </w:r>
+    </w:p>
+    <w:p>
+      <w:r>
+        <w:t xml:space="preserve">• `frontend/src/components/telemetry-side-panel.tsx`</w:t>
+      </w:r>
+    </w:p>
+    <w:p>
+      <w:r/>
+    </w:p>
+    <w:p>
+      <w:r>
+        <w:t xml:space="preserve">Verification for this pass:</w:t>
+      </w:r>
+    </w:p>
+    <w:p>
+      <w:r/>
+    </w:p>
+    <w:p>
+      <w:r>
+        <w:t xml:space="preserve">• backend tests: `21 passed`</w:t>
+      </w:r>
+    </w:p>
+    <w:p>
+      <w:r>
+        <w:t xml:space="preserve">• frontend production build: passed</w:t>
+      </w:r>
+    </w:p>
+    <w:p>
+      <w:r/>
+    </w:p>
+    <w:p>
+      <w:pPr>
+        <w:pStyle w:val="Heading3"/>
+      </w:pPr>
+      <w:r>
+        <w:t xml:space="preserve">Phase 21: Telemetry Shared Cursor Pass</w:t>
+      </w:r>
+    </w:p>
+    <w:p>
+      <w:r/>
+    </w:p>
+    <w:p>
+      <w:r>
+        <w:t xml:space="preserve">• Added a synchronized live cursor across the telemetry workspace so hovering any telemetry chart or the delta chart creates a shared inspection position.</w:t>
+      </w:r>
+    </w:p>
+    <w:p>
+      <w:r>
+        <w:t xml:space="preserve">• Each chart now shows a shared vertical reference line at the active hover distance, which makes cross-chart reading much easier.</w:t>
+      </w:r>
+    </w:p>
+    <w:p>
+      <w:r>
+        <w:t xml:space="preserve">• The dashboard now exposes a live cursor distance readout in the inspection controls.</w:t>
+      </w:r>
+    </w:p>
+    <w:p>
+      <w:r>
+        <w:t xml:space="preserve">• The telemetry side rail now includes a `Live Cursor Readout` section that shows per-trace speed, throttle, brake, gear, RPM, and steering values at the hovered distance.</w:t>
+      </w:r>
+    </w:p>
+    <w:p>
+      <w:r>
+        <w:t xml:space="preserve">• This makes the telemetry page behave much more like a real linked-cursor analysis desk instead of a set of independent charts.</w:t>
+      </w:r>
+    </w:p>
+    <w:p>
+      <w:r/>
+    </w:p>
+    <w:p>
+      <w:r>
+        <w:t xml:space="preserve">Technical files changed in this pass:</w:t>
+      </w:r>
+    </w:p>
+    <w:p>
+      <w:r/>
+    </w:p>
+    <w:p>
+      <w:r>
+        <w:t xml:space="preserve">• `frontend/src/components/telemetry-chart.tsx`</w:t>
+      </w:r>
+    </w:p>
+    <w:p>
+      <w:r>
+        <w:t xml:space="preserve">• `frontend/src/components/telemetry-delta-chart.tsx`</w:t>
+      </w:r>
+    </w:p>
+    <w:p>
+      <w:r>
+        <w:t xml:space="preserve">• `frontend/src/app/dashboard/page.tsx`</w:t>
+      </w:r>
+    </w:p>
+    <w:p>
+      <w:r>
+        <w:t xml:space="preserve">• `frontend/src/components/telemetry-side-panel.tsx`</w:t>
+      </w:r>
+    </w:p>
+    <w:p>
+      <w:r/>
+    </w:p>
+    <w:p>
+      <w:r>
+        <w:t xml:space="preserve">Verification for this pass:</w:t>
+      </w:r>
+    </w:p>
+    <w:p>
+      <w:r/>
+    </w:p>
+    <w:p>
+      <w:r>
+        <w:t xml:space="preserve">• backend tests: `21 passed`</w:t>
+      </w:r>
+    </w:p>
+    <w:p>
+      <w:r>
+        <w:t xml:space="preserve">• frontend production build: passed</w:t>
+      </w:r>
+    </w:p>
+    <w:p>
+      <w:r/>
+    </w:p>
+    <w:p>
+      <w:pPr>
+        <w:pStyle w:val="Heading3"/>
+      </w:pPr>
+      <w:r>
+        <w:t xml:space="preserve">Phase 22: Telemetry Track Navigator Pass</w:t>
+      </w:r>
+    </w:p>
+    <w:p>
+      <w:r/>
+    </w:p>
+    <w:p>
+      <w:r>
+        <w:t xml:space="preserve">• Added a real telemetry track map payload to the backend, derived from FastF1 lap position data and aligned to lap distance.</w:t>
+      </w:r>
+    </w:p>
+    <w:p>
+      <w:r>
+        <w:t xml:space="preserve">• The telemetry response now includes:</w:t>
+      </w:r>
+    </w:p>
+    <w:p>
+      <w:r>
+        <w:t xml:space="preserve">  - normalized reference-lap track points</w:t>
+      </w:r>
+    </w:p>
+    <w:p>
+      <w:r>
+        <w:t xml:space="preserve">  - corner markers placed at apex distances</w:t>
+      </w:r>
+    </w:p>
+    <w:p>
+      <w:r>
+        <w:t xml:space="preserve">  - track-aware corner positions for frontend navigation</w:t>
+      </w:r>
+    </w:p>
+    <w:p>
+      <w:r>
+        <w:t xml:space="preserve">• Replaced generic `C1`, `C2`-style corner naming with `T1`, `T2`, and so on, so the analysis reads more naturally.</w:t>
+      </w:r>
+    </w:p>
+    <w:p>
+      <w:r>
+        <w:t xml:space="preserve">• Added a `Track Navigator` panel to the dashboard:</w:t>
+      </w:r>
+    </w:p>
+    <w:p>
+      <w:r>
+        <w:t xml:space="preserve">  - clickable corner markers</w:t>
+      </w:r>
+    </w:p>
+    <w:p>
+      <w:r>
+        <w:t xml:space="preserve">  - highlighted focused corner</w:t>
+      </w:r>
+    </w:p>
+    <w:p>
+      <w:r>
+        <w:t xml:space="preserve">  - live cursor marker that follows the shared chart hover distance</w:t>
+      </w:r>
+    </w:p>
+    <w:p>
+      <w:r>
+        <w:t xml:space="preserve">• This makes the telemetry workspace spatial as well as numerical, which is a major step toward a real race-engineering desk.</w:t>
+      </w:r>
+    </w:p>
+    <w:p>
+      <w:r/>
+    </w:p>
+    <w:p>
+      <w:r>
+        <w:t xml:space="preserve">Technical files changed in this pass:</w:t>
+      </w:r>
+    </w:p>
+    <w:p>
+      <w:r/>
+    </w:p>
+    <w:p>
+      <w:r>
+        <w:t xml:space="preserve">• `backend/app/schemas/telemetry.py`</w:t>
+      </w:r>
+    </w:p>
+    <w:p>
+      <w:r>
+        <w:t xml:space="preserve">• `backend/app/services/fastf1_service.py`</w:t>
+      </w:r>
+    </w:p>
+    <w:p>
+      <w:r>
+        <w:t xml:space="preserve">• `backend/app/services/telemetry_service.py`</w:t>
+      </w:r>
+    </w:p>
+    <w:p>
+      <w:r>
+        <w:t xml:space="preserve">• `frontend/src/types/api.ts`</w:t>
+      </w:r>
+    </w:p>
+    <w:p>
+      <w:r>
+        <w:t xml:space="preserve">• `frontend/src/components/telemetry-track-map.tsx`</w:t>
+      </w:r>
+    </w:p>
+    <w:p>
+      <w:r>
+        <w:t xml:space="preserve">• `frontend/src/app/dashboard/page.tsx`</w:t>
+      </w:r>
+    </w:p>
+    <w:p>
+      <w:r/>
+    </w:p>
+    <w:p>
+      <w:r>
+        <w:t xml:space="preserve">Verification for this pass:</w:t>
+      </w:r>
+    </w:p>
+    <w:p>
+      <w:r/>
+    </w:p>
+    <w:p>
+      <w:r>
+        <w:t xml:space="preserve">• backend tests: `21 passed`</w:t>
+      </w:r>
+    </w:p>
+    <w:p>
+      <w:r>
+        <w:t xml:space="preserve">• frontend production build: passed</w:t>
+      </w:r>
+    </w:p>
+    <w:p>
+      <w:r/>
+    </w:p>
+    <w:p>
+      <w:pPr>
+        <w:pStyle w:val="Heading3"/>
+      </w:pPr>
+      <w:r>
+        <w:t xml:space="preserve">Phase 23: Telemetry Interpretation Pass</w:t>
+      </w:r>
+    </w:p>
+    <w:p>
+      <w:r/>
+    </w:p>
+    <w:p>
+      <w:r>
+        <w:t xml:space="preserve">• Reworked the telemetry side rail so it no longer behaves like a raw stats dump. It now explains how to read the workspace in operator language, section by section.</w:t>
+      </w:r>
+    </w:p>
+    <w:p>
+      <w:r>
+        <w:t xml:space="preserve">• Added a new `How To Read This Workspace` section to the telemetry rail that teaches users:</w:t>
+      </w:r>
+    </w:p>
+    <w:p>
+      <w:r>
+        <w:t xml:space="preserve">  - when to trust a whole-lap view</w:t>
+      </w:r>
+    </w:p>
+    <w:p>
+      <w:r>
+        <w:t xml:space="preserve">  - when to zoom into a focused slice</w:t>
+      </w:r>
+    </w:p>
+    <w:p>
+      <w:r>
+        <w:t xml:space="preserve">  - how to use the live cursor</w:t>
+      </w:r>
+    </w:p>
+    <w:p>
+      <w:r>
+        <w:t xml:space="preserve">  - how to interpret the selected delta pair</w:t>
+      </w:r>
+    </w:p>
+    <w:p>
+      <w:r>
+        <w:t xml:space="preserve">• Expanded the explanation copy across the telemetry rail:</w:t>
+      </w:r>
+    </w:p>
+    <w:p>
+      <w:r>
+        <w:t xml:space="preserve">  - `Performance Snapshot` now explains ideal lap, lap delta, and reference-lap meaning</w:t>
+      </w:r>
+    </w:p>
+    <w:p>
+      <w:r>
+        <w:t xml:space="preserve">  - `Selected Laps` explains why lap identity matters before judging pace</w:t>
+      </w:r>
+    </w:p>
+    <w:p>
+      <w:r>
+        <w:t xml:space="preserve">  - `Live Cursor Readout` now explains how to compare speed, brake, throttle, steering, gear, and RPM at the same distance point</w:t>
+      </w:r>
+    </w:p>
+    <w:p>
+      <w:r>
+        <w:t xml:space="preserve">  - `Same-Driver Lap Set Review` now frames spread and consistency as repeatability checks</w:t>
+      </w:r>
+    </w:p>
+    <w:p>
+      <w:r>
+        <w:t xml:space="preserve">  - `Delta Pair Review` now explains gain/loss logic, corner priority, and entry/apex/exit meaning</w:t>
+      </w:r>
+    </w:p>
+    <w:p>
+      <w:r>
+        <w:t xml:space="preserve">  - `Sector And Micro-Sector Analysis` now explains how to use broad sectors versus smaller distance slices</w:t>
+      </w:r>
+    </w:p>
+    <w:p>
+      <w:r>
+        <w:t xml:space="preserve">  - `Corner Loss Breakdown` now defines entry, apex, and exit in plain language</w:t>
+      </w:r>
+    </w:p>
+    <w:p>
+      <w:r>
+        <w:t xml:space="preserve">  - `Smart Analytics` now explicitly states that these are heuristics derived from FastF1-backed telemetry, not direct feed fields</w:t>
+      </w:r>
+    </w:p>
+    <w:p>
+      <w:r>
+        <w:t xml:space="preserve">• Added a top-level telemetry reading guide to the dashboard hero so users understand how to read charts, delta, and the track navigator before diving into the workspace.</w:t>
+      </w:r>
+    </w:p>
+    <w:p>
+      <w:r>
+        <w:t xml:space="preserve">• Added explanatory copy to:</w:t>
+      </w:r>
+    </w:p>
+    <w:p>
+      <w:r>
+        <w:t xml:space="preserve">  - telemetry signal charts</w:t>
+      </w:r>
+    </w:p>
+    <w:p>
+      <w:r>
+        <w:t xml:space="preserve">  - delta chart</w:t>
+      </w:r>
+    </w:p>
+    <w:p>
+      <w:r>
+        <w:t xml:space="preserve">  - track navigator</w:t>
+      </w:r>
+    </w:p>
+    <w:p>
+      <w:r>
+        <w:t xml:space="preserve">  - graph toggle controls</w:t>
+      </w:r>
+    </w:p>
+    <w:p>
+      <w:r>
+        <w:t xml:space="preserve">  - focused inspection window controls</w:t>
+      </w:r>
+    </w:p>
+    <w:p>
+      <w:r>
+        <w:t xml:space="preserve">• Hardened telemetry KPI summaries so invalid values such as `-Infinity km/h` do not surface when FastF1 returns incomplete session metrics or the page is still transitioning through loading states.</w:t>
+      </w:r>
+    </w:p>
+    <w:p>
+      <w:r>
+        <w:t xml:space="preserve">• Cleaned up remaining UI text artifacts and replaced broken encoded symbols in the telemetry workspace with stable plain-text formatting.</w:t>
+      </w:r>
+    </w:p>
+    <w:p>
+      <w:r/>
+    </w:p>
+    <w:p>
+      <w:r>
+        <w:t xml:space="preserve">Technical files changed in this pass:</w:t>
+      </w:r>
+    </w:p>
+    <w:p>
+      <w:r/>
+    </w:p>
+    <w:p>
+      <w:r>
+        <w:t xml:space="preserve">• `frontend/src/app/dashboard/page.tsx`</w:t>
+      </w:r>
+    </w:p>
+    <w:p>
+      <w:r>
+        <w:t xml:space="preserve">• `frontend/src/components/telemetry-chart.tsx`</w:t>
+      </w:r>
+    </w:p>
+    <w:p>
+      <w:r>
+        <w:t xml:space="preserve">• `frontend/src/components/telemetry-delta-chart.tsx`</w:t>
+      </w:r>
+    </w:p>
+    <w:p>
+      <w:r>
+        <w:t xml:space="preserve">• `frontend/src/components/telemetry-side-panel.tsx`</w:t>
+      </w:r>
+    </w:p>
+    <w:p>
+      <w:r>
+        <w:t xml:space="preserve">• `frontend/src/components/telemetry-track-map.tsx`</w:t>
       </w:r>
     </w:p>
     <w:p>

</xml_diff>

<commit_message>
More telemetry changes with better representation and edits
</commit_message>
<xml_diff>
--- a/docs/ApexAI_Project_Record.docx
+++ b/docs/ApexAI_Project_Record.docx
@@ -15,7 +15,7 @@
     </w:p>
     <w:p>
       <w:r>
-        <w:t xml:space="preserve">Last updated: 2026-05-19</w:t>
+        <w:t xml:space="preserve">Last updated: 2026-05-26</w:t>
       </w:r>
     </w:p>
     <w:p>
@@ -55,7 +55,7 @@
     </w:p>
     <w:p>
       <w:r>
-        <w:t xml:space="preserve">Whenever a new change is made, this file should be updated first and the DOCX export should be regenerated from it.</w:t>
+        <w:t xml:space="preserve">Whenever a new change is made, this file must be updated in the same pass and the DOCX export should be regenerated from it.</w:t>
       </w:r>
     </w:p>
     <w:p>
@@ -66,6 +66,69 @@
         <w:pStyle w:val="Heading2"/>
       </w:pPr>
       <w:r>
+        <w:t xml:space="preserve">Documentation Discipline</w:t>
+      </w:r>
+    </w:p>
+    <w:p>
+      <w:r/>
+    </w:p>
+    <w:p>
+      <w:r>
+        <w:t xml:space="preserve">Every implementation pass must leave a human-readable record behind. This is required for feature work, bug fixes, setup changes, styling changes, data-model changes, and operational fixes.</w:t>
+      </w:r>
+    </w:p>
+    <w:p>
+      <w:r/>
+    </w:p>
+    <w:p>
+      <w:r>
+        <w:t xml:space="preserve">Each change log entry should explain:</w:t>
+      </w:r>
+    </w:p>
+    <w:p>
+      <w:r/>
+    </w:p>
+    <w:p>
+      <w:r>
+        <w:t xml:space="preserve">• what changed in plain language</w:t>
+      </w:r>
+    </w:p>
+    <w:p>
+      <w:r>
+        <w:t xml:space="preserve">• why the change was made</w:t>
+      </w:r>
+    </w:p>
+    <w:p>
+      <w:r>
+        <w:t xml:space="preserve">• which parts of the system were touched</w:t>
+      </w:r>
+    </w:p>
+    <w:p>
+      <w:r>
+        <w:t xml:space="preserve">• how the change was verified</w:t>
+      </w:r>
+    </w:p>
+    <w:p>
+      <w:r>
+        <w:t xml:space="preserve">• any known caveats, follow-ups, or environment notes</w:t>
+      </w:r>
+    </w:p>
+    <w:p>
+      <w:r/>
+    </w:p>
+    <w:p>
+      <w:r>
+        <w:t xml:space="preserve">For normal code changes, update this Markdown file before considering the task complete. If the change affects the user-facing app, API contracts, setup flow, data model, or project behavior, also regenerate `docs/ApexAI_Project_Record.docx` from this source using `docs/generate_project_doc.py`.</w:t>
+      </w:r>
+    </w:p>
+    <w:p>
+      <w:r/>
+    </w:p>
+    <w:p>
+      <w:pPr>
+        <w:pStyle w:val="Heading2"/>
+      </w:pPr>
+      <w:r>
         <w:t xml:space="preserve">Project Summary</w:t>
       </w:r>
     </w:p>
@@ -170,6 +233,445 @@
       </w:pPr>
       <w:r>
         <w:t xml:space="preserve">Chronological Update History</w:t>
+      </w:r>
+    </w:p>
+    <w:p>
+      <w:r/>
+    </w:p>
+    <w:p>
+      <w:pPr>
+        <w:pStyle w:val="Heading3"/>
+      </w:pPr>
+      <w:r>
+        <w:t xml:space="preserve">Phase 25: Telemetry Backend Completion Pass</w:t>
+      </w:r>
+    </w:p>
+    <w:p>
+      <w:r/>
+    </w:p>
+    <w:p>
+      <w:r>
+        <w:t xml:space="preserve">• Completed the backend-focused telemetry refinement pass so the feature can be treated as a stable analytics contract before moving attention to other product areas.</w:t>
+      </w:r>
+    </w:p>
+    <w:p>
+      <w:r>
+        <w:t xml:space="preserve">• Added track-specific corner naming fallback support:</w:t>
+      </w:r>
+    </w:p>
+    <w:p>
+      <w:r>
+        <w:t xml:space="preserve">  - known circuit maps can attach official names such as Silverstone `Abbey` to detected telemetry turns</w:t>
+      </w:r>
+    </w:p>
+    <w:p>
+      <w:r>
+        <w:t xml:space="preserve">  - inferred labels remain available when a circuit is not in the backend map</w:t>
+      </w:r>
+    </w:p>
+    <w:p>
+      <w:r>
+        <w:t xml:space="preserve">  - stable `T1`, `T2`, etc. identifiers are preserved for focus and navigation behavior</w:t>
+      </w:r>
+    </w:p>
+    <w:p>
+      <w:r>
+        <w:t xml:space="preserve">• Improved corner segmentation metadata:</w:t>
+      </w:r>
+    </w:p>
+    <w:p>
+      <w:r>
+        <w:t xml:space="preserve">  - each detected corner now carries a `confidence_score`</w:t>
+      </w:r>
+    </w:p>
+    <w:p>
+      <w:r>
+        <w:t xml:space="preserve">  - each detected corner now carries a `segmentation_quality` value of `low`, `medium`, or `high`</w:t>
+      </w:r>
+    </w:p>
+    <w:p>
+      <w:r>
+        <w:t xml:space="preserve">  - track-map corner markers inherit the same confidence and naming metadata</w:t>
+      </w:r>
+    </w:p>
+    <w:p>
+      <w:r>
+        <w:t xml:space="preserve">• Added richer backend-owned lap benchmarking:</w:t>
+      </w:r>
+    </w:p>
+    <w:p>
+      <w:r>
+        <w:t xml:space="preserve">  - `benchmark_rankings` ranks selected traces by overall lap time</w:t>
+      </w:r>
+    </w:p>
+    <w:p>
+      <w:r>
+        <w:t xml:space="preserve">  - rankings include braking, apex, exit, straight-line, and consistency ranks</w:t>
+      </w:r>
+    </w:p>
+    <w:p>
+      <w:r>
+        <w:t xml:space="preserve">  - rankings identify each trace's main backend-detected loss corner when one dominates</w:t>
+      </w:r>
+    </w:p>
+    <w:p>
+      <w:r>
+        <w:t xml:space="preserve">• Added pair-ready backend delta contracts:</w:t>
+      </w:r>
+    </w:p>
+    <w:p>
+      <w:r>
+        <w:t xml:space="preserve">  - `pair_deltas` now contains reference/comparison lap deltas for every selected trace pair</w:t>
+      </w:r>
+    </w:p>
+    <w:p>
+      <w:r>
+        <w:t xml:space="preserve">  - each pair includes corner-level entry, apex, exit, braking-point, and throttle-pickup deltas</w:t>
+      </w:r>
+    </w:p>
+    <w:p>
+      <w:r>
+        <w:t xml:space="preserve">  - this reduces how much comparison logic future frontend views need to reconstruct locally</w:t>
+      </w:r>
+    </w:p>
+    <w:p>
+      <w:r>
+        <w:t xml:space="preserve">• Added explicit telemetry unavailable diagnostics:</w:t>
+      </w:r>
+    </w:p>
+    <w:p>
+      <w:r>
+        <w:t xml:space="preserve">  - unavailable payloads now include `unavailable_reason`</w:t>
+      </w:r>
+    </w:p>
+    <w:p>
+      <w:r>
+        <w:t xml:space="preserve">  - cache metadata includes diagnostics explaining missing FastF1, missing session, missing selected drivers, or missing telemetry streams</w:t>
+      </w:r>
+    </w:p>
+    <w:p>
+      <w:r>
+        <w:t xml:space="preserve">• Added telemetry cache metadata:</w:t>
+      </w:r>
+    </w:p>
+    <w:p>
+      <w:r>
+        <w:t xml:space="preserve">  - responses include cache key, generation timestamp, series count, cache hit state, diagnostics, and unavailable reason</w:t>
+      </w:r>
+    </w:p>
+    <w:p>
+      <w:r>
+        <w:t xml:space="preserve">  - cached telemetry responses are marked as cache hits on subsequent backend reads</w:t>
+      </w:r>
+    </w:p>
+    <w:p>
+      <w:r>
+        <w:t xml:space="preserve">• Added focused synthetic backend tests for telemetry analytics helper behavior without depending on live FastF1 availability.</w:t>
+      </w:r>
+    </w:p>
+    <w:p>
+      <w:r/>
+    </w:p>
+    <w:p>
+      <w:r>
+        <w:t xml:space="preserve">Technical files changed in this pass:</w:t>
+      </w:r>
+    </w:p>
+    <w:p>
+      <w:r/>
+    </w:p>
+    <w:p>
+      <w:r>
+        <w:t xml:space="preserve">• `backend/app/schemas/telemetry.py`</w:t>
+      </w:r>
+    </w:p>
+    <w:p>
+      <w:r>
+        <w:t xml:space="preserve">• `backend/app/services/fastf1_service.py`</w:t>
+      </w:r>
+    </w:p>
+    <w:p>
+      <w:r>
+        <w:t xml:space="preserve">• `backend/app/services/telemetry_service.py`</w:t>
+      </w:r>
+    </w:p>
+    <w:p>
+      <w:r>
+        <w:t xml:space="preserve">• `backend/tests/test_telemetry_analytics.py`</w:t>
+      </w:r>
+    </w:p>
+    <w:p>
+      <w:r>
+        <w:t xml:space="preserve">• `frontend/src/types/api.ts`</w:t>
+      </w:r>
+    </w:p>
+    <w:p>
+      <w:r>
+        <w:t xml:space="preserve">• `docs/APEXAI_MASTER_RECORD.md`</w:t>
+      </w:r>
+    </w:p>
+    <w:p>
+      <w:r>
+        <w:t xml:space="preserve">• `docs/ApexAI_Project_Record.docx`</w:t>
+      </w:r>
+    </w:p>
+    <w:p>
+      <w:r/>
+    </w:p>
+    <w:p>
+      <w:r>
+        <w:t xml:space="preserve">Verification for this pass:</w:t>
+      </w:r>
+    </w:p>
+    <w:p>
+      <w:r/>
+    </w:p>
+    <w:p>
+      <w:r>
+        <w:t xml:space="preserve">• backend syntax check: `python -m py_compile backend/app/schemas/telemetry.py backend/app/services/fastf1_service.py backend/app/services/telemetry_service.py backend/tests/test_telemetry_analytics.py`</w:t>
+      </w:r>
+    </w:p>
+    <w:p>
+      <w:r>
+        <w:t xml:space="preserve">• synthetic telemetry analytics tests: `pytest backend/tests/test_telemetry_analytics.py`</w:t>
+      </w:r>
+    </w:p>
+    <w:p>
+      <w:r>
+        <w:t xml:space="preserve">• telemetry API regression test: `pytest backend/tests/test_api.py -k telemetry`</w:t>
+      </w:r>
+    </w:p>
+    <w:p>
+      <w:r>
+        <w:t xml:space="preserve">• full backend regression suite: `pytest backend/tests` with `24 passed`</w:t>
+      </w:r>
+    </w:p>
+    <w:p>
+      <w:r>
+        <w:t xml:space="preserve">• frontend production build: `npm run build`</w:t>
+      </w:r>
+    </w:p>
+    <w:p>
+      <w:r/>
+    </w:p>
+    <w:p>
+      <w:r>
+        <w:t xml:space="preserve">Known notes:</w:t>
+      </w:r>
+    </w:p>
+    <w:p>
+      <w:r/>
+    </w:p>
+    <w:p>
+      <w:r>
+        <w:t xml:space="preserve">• These changes are additive. Existing telemetry fields remain in place for current frontend behavior.</w:t>
+      </w:r>
+    </w:p>
+    <w:p>
+      <w:r>
+        <w:t xml:space="preserve">• Official corner naming is intentionally a backend fallback map, not a full FIA circuit database. Unsupported circuits still receive inferred telemetry labels.</w:t>
+      </w:r>
+    </w:p>
+    <w:p>
+      <w:r/>
+    </w:p>
+    <w:p>
+      <w:pPr>
+        <w:pStyle w:val="Heading3"/>
+      </w:pPr>
+      <w:r>
+        <w:t xml:space="preserve">Phase 24: Telemetry Coaching And Benchmark Readability Pass</w:t>
+      </w:r>
+    </w:p>
+    <w:p>
+      <w:r/>
+    </w:p>
+    <w:p>
+      <w:r>
+        <w:t xml:space="preserve">• Strengthened the telemetry coaching layer so the side panel now explains selected trace pace in a more actionable race-engineering format instead of only showing raw summary heuristics.</w:t>
+      </w:r>
+    </w:p>
+    <w:p>
+      <w:r>
+        <w:t xml:space="preserve">• Added richer selected-trace benchmark ranking:</w:t>
+      </w:r>
+    </w:p>
+    <w:p>
+      <w:r>
+        <w:t xml:space="preserve">  - each selected trace is ranked against the selected lap set</w:t>
+      </w:r>
+    </w:p>
+    <w:p>
+      <w:r>
+        <w:t xml:space="preserve">  - each trace shows delta to the best selected benchmark lap</w:t>
+      </w:r>
+    </w:p>
+    <w:p>
+      <w:r>
+        <w:t xml:space="preserve">  - each trace highlights its main corner deficit or best-matched corner</w:t>
+      </w:r>
+    </w:p>
+    <w:p>
+      <w:r>
+        <w:t xml:space="preserve">  - coaching cues point the user toward the highest-value driving correction</w:t>
+      </w:r>
+    </w:p>
+    <w:p>
+      <w:r>
+        <w:t xml:space="preserve">• Improved corner naming and labeling across the telemetry feature:</w:t>
+      </w:r>
+    </w:p>
+    <w:p>
+      <w:r>
+        <w:t xml:space="preserve">  - backend corner payloads now include `corner_label` and `corner_hint`</w:t>
+      </w:r>
+    </w:p>
+    <w:p>
+      <w:r>
+        <w:t xml:space="preserve">  - labels include corner number, speed class, approximate shape, and whether the window behaves like a corner or complex</w:t>
+      </w:r>
+    </w:p>
+    <w:p>
+      <w:r>
+        <w:t xml:space="preserve">  - track-map markers and dashboard corner controls now surface the richer labels and hints</w:t>
+      </w:r>
+    </w:p>
+    <w:p>
+      <w:r>
+        <w:t xml:space="preserve">• Extended telemetry performance summaries with:</w:t>
+      </w:r>
+    </w:p>
+    <w:p>
+      <w:r>
+        <w:t xml:space="preserve">  - `lap_rank`</w:t>
+      </w:r>
+    </w:p>
+    <w:p>
+      <w:r>
+        <w:t xml:space="preserve">  - `delta_to_best_seconds`</w:t>
+      </w:r>
+    </w:p>
+    <w:p>
+      <w:r>
+        <w:t xml:space="preserve">  - `benchmark_summary`</w:t>
+      </w:r>
+    </w:p>
+    <w:p>
+      <w:r>
+        <w:t xml:space="preserve">  - `coaching_focus`</w:t>
+      </w:r>
+    </w:p>
+    <w:p>
+      <w:r>
+        <w:t xml:space="preserve">• Preserved the existing `T1`, `T2`, etc. identifiers for stable focus behavior while adding descriptive labels for humans.</w:t>
+      </w:r>
+    </w:p>
+    <w:p>
+      <w:r>
+        <w:t xml:space="preserve">• Fixed a track-map payload omission so selected lap payloads carry `track_map_points` through to the composed telemetry response.</w:t>
+      </w:r>
+    </w:p>
+    <w:p>
+      <w:r>
+        <w:t xml:space="preserve">• Added this documentation discipline section so future implementation passes must be logged in the project record.</w:t>
+      </w:r>
+    </w:p>
+    <w:p>
+      <w:r/>
+    </w:p>
+    <w:p>
+      <w:r>
+        <w:t xml:space="preserve">Technical files changed in this pass:</w:t>
+      </w:r>
+    </w:p>
+    <w:p>
+      <w:r/>
+    </w:p>
+    <w:p>
+      <w:r>
+        <w:t xml:space="preserve">• `backend/app/schemas/telemetry.py`</w:t>
+      </w:r>
+    </w:p>
+    <w:p>
+      <w:r>
+        <w:t xml:space="preserve">• `backend/app/services/fastf1_service.py`</w:t>
+      </w:r>
+    </w:p>
+    <w:p>
+      <w:r>
+        <w:t xml:space="preserve">• `frontend/src/app/dashboard/page.tsx`</w:t>
+      </w:r>
+    </w:p>
+    <w:p>
+      <w:r>
+        <w:t xml:space="preserve">• `frontend/src/components/telemetry-side-panel.tsx`</w:t>
+      </w:r>
+    </w:p>
+    <w:p>
+      <w:r>
+        <w:t xml:space="preserve">• `frontend/src/components/telemetry-track-map.tsx`</w:t>
+      </w:r>
+    </w:p>
+    <w:p>
+      <w:r>
+        <w:t xml:space="preserve">• `frontend/src/types/api.ts`</w:t>
+      </w:r>
+    </w:p>
+    <w:p>
+      <w:r>
+        <w:t xml:space="preserve">• `docs/APEXAI_MASTER_RECORD.md`</w:t>
+      </w:r>
+    </w:p>
+    <w:p>
+      <w:r>
+        <w:t xml:space="preserve">• `docs/ApexAI_Project_Record.docx`</w:t>
+      </w:r>
+    </w:p>
+    <w:p>
+      <w:r/>
+    </w:p>
+    <w:p>
+      <w:r>
+        <w:t xml:space="preserve">Verification for this pass:</w:t>
+      </w:r>
+    </w:p>
+    <w:p>
+      <w:r/>
+    </w:p>
+    <w:p>
+      <w:r>
+        <w:t xml:space="preserve">• backend syntax check: `python -m py_compile backend/app/schemas/telemetry.py backend/app/services/fastf1_service.py`</w:t>
+      </w:r>
+    </w:p>
+    <w:p>
+      <w:r>
+        <w:t xml:space="preserve">• frontend production build: `npm run build`</w:t>
+      </w:r>
+    </w:p>
+    <w:p>
+      <w:r>
+        <w:t xml:space="preserve">• telemetry API regression test: `pytest backend/tests/test_api.py -k telemetry`</w:t>
+      </w:r>
+    </w:p>
+    <w:p>
+      <w:r>
+        <w:t xml:space="preserve">• manual local run confirmed backend/frontend login and telemetry workspace behavior</w:t>
+      </w:r>
+    </w:p>
+    <w:p>
+      <w:r/>
+    </w:p>
+    <w:p>
+      <w:r>
+        <w:t xml:space="preserve">Known notes:</w:t>
+      </w:r>
+    </w:p>
+    <w:p>
+      <w:r/>
+    </w:p>
+    <w:p>
+      <w:r>
+        <w:t xml:space="preserve">• A full backend test run exposed an existing unrelated FastF1 weekend-context assertion where the endpoint reported `source=fastf1` with zero drivers. The telemetry-specific test passed.</w:t>
       </w:r>
     </w:p>
     <w:p>

</xml_diff>

<commit_message>
Finished telemetry as of now and moved on to the driver comparison feature
</commit_message>
<xml_diff>
--- a/docs/ApexAI_Project_Record.docx
+++ b/docs/ApexAI_Project_Record.docx
@@ -15,7 +15,7 @@
     </w:p>
     <w:p>
       <w:r>
-        <w:t xml:space="preserve">Last updated: 2026-05-26</w:t>
+        <w:t xml:space="preserve">Last updated: 2026-06-01</w:t>
       </w:r>
     </w:p>
     <w:p>
@@ -233,6 +233,420 @@
       </w:pPr>
       <w:r>
         <w:t xml:space="preserve">Chronological Update History</w:t>
+      </w:r>
+    </w:p>
+    <w:p>
+      <w:r/>
+    </w:p>
+    <w:p>
+      <w:pPr>
+        <w:pStyle w:val="Heading3"/>
+      </w:pPr>
+      <w:r>
+        <w:t xml:space="preserve">Phase 27: Driver Compare Completion Pass</w:t>
+      </w:r>
+    </w:p>
+    <w:p>
+      <w:r/>
+    </w:p>
+    <w:p>
+      <w:r>
+        <w:t xml:space="preserve">• Reworked Driver Compare from a shallow metric duel into a data-rich FastF1 telemetry comparison workspace.</w:t>
+      </w:r>
+    </w:p>
+    <w:p>
+      <w:r>
+        <w:t xml:space="preserve">• Preserved the existing FastF1 data source path by continuing to use the telemetry API rather than hardcoded comparison data.</w:t>
+      </w:r>
+    </w:p>
+    <w:p>
+      <w:r>
+        <w:t xml:space="preserve">• Added exact lap selection for each compared driver:</w:t>
+      </w:r>
+    </w:p>
+    <w:p>
+      <w:r>
+        <w:t xml:space="preserve">  - lap choices come from FastF1-backed `lap_options`</w:t>
+      </w:r>
+    </w:p>
+    <w:p>
+      <w:r>
+        <w:t xml:space="preserve">  - each side compares one selected lap so the result is a clean driver-versus-driver benchmark</w:t>
+      </w:r>
+    </w:p>
+    <w:p>
+      <w:r>
+        <w:t xml:space="preserve">  - default lap selection normalizes to the best available lap returned by the telemetry response</w:t>
+      </w:r>
+    </w:p>
+    <w:p>
+      <w:r>
+        <w:t xml:space="preserve">• Added a clear comparison verdict:</w:t>
+      </w:r>
+    </w:p>
+    <w:p>
+      <w:r>
+        <w:t xml:space="preserve">  - explains which selected lap is faster</w:t>
+      </w:r>
+    </w:p>
+    <w:p>
+      <w:r>
+        <w:t xml:space="preserve">  - uses backend `pair_deltas` when available</w:t>
+      </w:r>
+    </w:p>
+    <w:p>
+      <w:r>
+        <w:t xml:space="preserve">  - falls back safely when complete lap timing is not available</w:t>
+      </w:r>
+    </w:p>
+    <w:p>
+      <w:r>
+        <w:t xml:space="preserve">• Added richer driver cards with lap time, compound, throttle, brake time, and top-speed context.</w:t>
+      </w:r>
+    </w:p>
+    <w:p>
+      <w:r>
+        <w:t xml:space="preserve">• Added sector delta analysis for S1, S2, and S3 so the user can see broad lap-shape differences before reading corner-level detail.</w:t>
+      </w:r>
+    </w:p>
+    <w:p>
+      <w:r>
+        <w:t xml:space="preserve">• Added backend rank display using telemetry `benchmark_rankings`:</w:t>
+      </w:r>
+    </w:p>
+    <w:p>
+      <w:r>
+        <w:t xml:space="preserve">  - overall rank</w:t>
+      </w:r>
+    </w:p>
+    <w:p>
+      <w:r>
+        <w:t xml:space="preserve">  - braking rank</w:t>
+      </w:r>
+    </w:p>
+    <w:p>
+      <w:r>
+        <w:t xml:space="preserve">  - apex rank</w:t>
+      </w:r>
+    </w:p>
+    <w:p>
+      <w:r>
+        <w:t xml:space="preserve">  - exit rank</w:t>
+      </w:r>
+    </w:p>
+    <w:p>
+      <w:r>
+        <w:t xml:space="preserve">  - straight-line rank</w:t>
+      </w:r>
+    </w:p>
+    <w:p>
+      <w:r>
+        <w:t xml:space="preserve">  - consistency rank</w:t>
+      </w:r>
+    </w:p>
+    <w:p>
+      <w:r>
+        <w:t xml:space="preserve">• Added corner gain/loss analysis from backend `pair_deltas`:</w:t>
+      </w:r>
+    </w:p>
+    <w:p>
+      <w:r>
+        <w:t xml:space="preserve">  - strongest relative gain for the comparison trace</w:t>
+      </w:r>
+    </w:p>
+    <w:p>
+      <w:r>
+        <w:t xml:space="preserve">  - largest relative loss for the comparison trace</w:t>
+      </w:r>
+    </w:p>
+    <w:p>
+      <w:r>
+        <w:t xml:space="preserve">  - top corner rows with total, entry, apex, and exit deltas</w:t>
+      </w:r>
+    </w:p>
+    <w:p>
+      <w:r>
+        <w:t xml:space="preserve">  - braking-point and throttle-pickup distance shifts</w:t>
+      </w:r>
+    </w:p>
+    <w:p>
+      <w:r>
+        <w:t xml:space="preserve">• Added data-quality reporting for compare:</w:t>
+      </w:r>
+    </w:p>
+    <w:p>
+      <w:r>
+        <w:t xml:space="preserve">  - cache hit state</w:t>
+      </w:r>
+    </w:p>
+    <w:p>
+      <w:r>
+        <w:t xml:space="preserve">  - number of loaded telemetry traces</w:t>
+      </w:r>
+    </w:p>
+    <w:p>
+      <w:r>
+        <w:t xml:space="preserve">  - unavailable reason</w:t>
+      </w:r>
+    </w:p>
+    <w:p>
+      <w:r>
+        <w:t xml:space="preserve">  - FastF1 diagnostics when present</w:t>
+      </w:r>
+    </w:p>
+    <w:p>
+      <w:r>
+        <w:t xml:space="preserve">• Added a copyable comparison debrief for users who want to move the analysis into a report or notes.</w:t>
+      </w:r>
+    </w:p>
+    <w:p>
+      <w:r>
+        <w:t xml:space="preserve">• Removed hardcoded default driver assumptions from the compare workflow; selected drivers now come from the loaded FastF1 weekend context.</w:t>
+      </w:r>
+    </w:p>
+    <w:p>
+      <w:r/>
+    </w:p>
+    <w:p>
+      <w:r>
+        <w:t xml:space="preserve">Technical files changed in this pass:</w:t>
+      </w:r>
+    </w:p>
+    <w:p>
+      <w:r/>
+    </w:p>
+    <w:p>
+      <w:r>
+        <w:t xml:space="preserve">• `frontend/src/app/compare/page.tsx`</w:t>
+      </w:r>
+    </w:p>
+    <w:p>
+      <w:r>
+        <w:t xml:space="preserve">• `docs/APEXAI_MASTER_RECORD.md`</w:t>
+      </w:r>
+    </w:p>
+    <w:p>
+      <w:r>
+        <w:t xml:space="preserve">• `docs/ApexAI_Project_Record.docx`</w:t>
+      </w:r>
+    </w:p>
+    <w:p>
+      <w:r/>
+    </w:p>
+    <w:p>
+      <w:r>
+        <w:t xml:space="preserve">Verification for this pass:</w:t>
+      </w:r>
+    </w:p>
+    <w:p>
+      <w:r/>
+    </w:p>
+    <w:p>
+      <w:r>
+        <w:t xml:space="preserve">• frontend production build: `npm run build`</w:t>
+      </w:r>
+    </w:p>
+    <w:p>
+      <w:r/>
+    </w:p>
+    <w:p>
+      <w:r>
+        <w:t xml:space="preserve">Known notes:</w:t>
+      </w:r>
+    </w:p>
+    <w:p>
+      <w:r/>
+    </w:p>
+    <w:p>
+      <w:r>
+        <w:t xml:space="preserve">• This pass focuses on feature completeness and readable data presentation. A broader visual decluttering pass is intentionally deferred until after the remaining product features are functionally complete.</w:t>
+      </w:r>
+    </w:p>
+    <w:p>
+      <w:r/>
+    </w:p>
+    <w:p>
+      <w:pPr>
+        <w:pStyle w:val="Heading3"/>
+      </w:pPr>
+      <w:r>
+        <w:t xml:space="preserve">Phase 26: Telemetry Finalization And Handoff Pass</w:t>
+      </w:r>
+    </w:p>
+    <w:p>
+      <w:r/>
+    </w:p>
+    <w:p>
+      <w:r>
+        <w:t xml:space="preserve">• Closed the remaining telemetry feature gaps so the project can move on to other website features without leaving backend telemetry metadata unused.</w:t>
+      </w:r>
+    </w:p>
+    <w:p>
+      <w:r>
+        <w:t xml:space="preserve">• Surfaced backend-owned telemetry analytics in the dashboard:</w:t>
+      </w:r>
+    </w:p>
+    <w:p>
+      <w:r>
+        <w:t xml:space="preserve">  - side-panel benchmark ranking now prefers the backend `benchmark_rankings` contract</w:t>
+      </w:r>
+    </w:p>
+    <w:p>
+      <w:r>
+        <w:t xml:space="preserve">  - selected pair review now prefers the backend `pair_deltas` contract</w:t>
+      </w:r>
+    </w:p>
+    <w:p>
+      <w:r>
+        <w:t xml:space="preserve">  - fallback frontend calculations remain available if older payloads do not include the new fields</w:t>
+      </w:r>
+    </w:p>
+    <w:p>
+      <w:r>
+        <w:t xml:space="preserve">• Added visible telemetry data-quality reporting:</w:t>
+      </w:r>
+    </w:p>
+    <w:p>
+      <w:r>
+        <w:t xml:space="preserve">  - corner cards now show confidence percentage and segmentation quality</w:t>
+      </w:r>
+    </w:p>
+    <w:p>
+      <w:r>
+        <w:t xml:space="preserve">  - low-confidence corners are summarized in the side panel</w:t>
+      </w:r>
+    </w:p>
+    <w:p>
+      <w:r>
+        <w:t xml:space="preserve">  - cache hit state, cache key, generated timestamp, series count, unavailable reason, and diagnostics are shown in an operator-oriented data-quality panel</w:t>
+      </w:r>
+    </w:p>
+    <w:p>
+      <w:r>
+        <w:t xml:space="preserve">• Improved track-map confidence readability:</w:t>
+      </w:r>
+    </w:p>
+    <w:p>
+      <w:r>
+        <w:t xml:space="preserve">  - marker colors now reflect high, medium, and low backend corner confidence</w:t>
+      </w:r>
+    </w:p>
+    <w:p>
+      <w:r>
+        <w:t xml:space="preserve">  - corner shortcut chips include confidence percentage when available</w:t>
+      </w:r>
+    </w:p>
+    <w:p>
+      <w:r>
+        <w:t xml:space="preserve">• Added a telemetry debrief handoff block:</w:t>
+      </w:r>
+    </w:p>
+    <w:p>
+      <w:r>
+        <w:t xml:space="preserve">  - dashboard generates a concise text debrief from selected traces, benchmark ranking, pair delta, priority corner, cache state, and data quality</w:t>
+      </w:r>
+    </w:p>
+    <w:p>
+      <w:r>
+        <w:t xml:space="preserve">  - debrief can be copied for use in the report workflow or external notes</w:t>
+      </w:r>
+    </w:p>
+    <w:p>
+      <w:r>
+        <w:t xml:space="preserve">• Expanded backend official-corner fallback coverage for common F1 venues beyond the initial small map.</w:t>
+      </w:r>
+    </w:p>
+    <w:p>
+      <w:r>
+        <w:t xml:space="preserve">• Preserved all existing telemetry behavior, including selected lap overlays, chart toggles, corner focus, drag-to-zoom, live cursor, delta chart, track map, and coaching side panel.</w:t>
+      </w:r>
+    </w:p>
+    <w:p>
+      <w:r/>
+    </w:p>
+    <w:p>
+      <w:r>
+        <w:t xml:space="preserve">Technical files changed in this pass:</w:t>
+      </w:r>
+    </w:p>
+    <w:p>
+      <w:r/>
+    </w:p>
+    <w:p>
+      <w:r>
+        <w:t xml:space="preserve">• `backend/app/services/fastf1_service.py`</w:t>
+      </w:r>
+    </w:p>
+    <w:p>
+      <w:r>
+        <w:t xml:space="preserve">• `frontend/src/app/dashboard/page.tsx`</w:t>
+      </w:r>
+    </w:p>
+    <w:p>
+      <w:r>
+        <w:t xml:space="preserve">• `frontend/src/components/telemetry-side-panel.tsx`</w:t>
+      </w:r>
+    </w:p>
+    <w:p>
+      <w:r>
+        <w:t xml:space="preserve">• `frontend/src/components/telemetry-track-map.tsx`</w:t>
+      </w:r>
+    </w:p>
+    <w:p>
+      <w:r>
+        <w:t xml:space="preserve">• `docs/APEXAI_MASTER_RECORD.md`</w:t>
+      </w:r>
+    </w:p>
+    <w:p>
+      <w:r>
+        <w:t xml:space="preserve">• `docs/ApexAI_Project_Record.docx`</w:t>
+      </w:r>
+    </w:p>
+    <w:p>
+      <w:r/>
+    </w:p>
+    <w:p>
+      <w:r>
+        <w:t xml:space="preserve">Verification for this pass:</w:t>
+      </w:r>
+    </w:p>
+    <w:p>
+      <w:r/>
+    </w:p>
+    <w:p>
+      <w:r>
+        <w:t xml:space="preserve">• backend syntax check: `python -m py_compile backend/app/services/fastf1_service.py`</w:t>
+      </w:r>
+    </w:p>
+    <w:p>
+      <w:r>
+        <w:t xml:space="preserve">• synthetic telemetry analytics tests: `pytest backend/tests/test_telemetry_analytics.py`</w:t>
+      </w:r>
+    </w:p>
+    <w:p>
+      <w:r>
+        <w:t xml:space="preserve">• full backend regression suite: `pytest backend/tests` with `24 passed`</w:t>
+      </w:r>
+    </w:p>
+    <w:p>
+      <w:r>
+        <w:t xml:space="preserve">• frontend production build: `npm run build`</w:t>
+      </w:r>
+    </w:p>
+    <w:p>
+      <w:r/>
+    </w:p>
+    <w:p>
+      <w:r>
+        <w:t xml:space="preserve">Known notes:</w:t>
+      </w:r>
+    </w:p>
+    <w:p>
+      <w:r/>
+    </w:p>
+    <w:p>
+      <w:r>
+        <w:t xml:space="preserve">• Telemetry is now considered complete enough to move on. Remaining future work would be deeper product integration, not missing core telemetry capability.</w:t>
       </w:r>
     </w:p>
     <w:p>

</xml_diff>

<commit_message>
Converted the dual terminal working to a single terminal and single line workflow
</commit_message>
<xml_diff>
--- a/docs/ApexAI_Project_Record.docx
+++ b/docs/ApexAI_Project_Record.docx
@@ -15,7 +15,7 @@
     </w:p>
     <w:p>
       <w:r>
-        <w:t xml:space="preserve">Last updated: 2026-06-01</w:t>
+        <w:t xml:space="preserve">Last updated: 2026-06-11</w:t>
       </w:r>
     </w:p>
     <w:p>
@@ -233,6 +233,435 @@
       </w:pPr>
       <w:r>
         <w:t xml:space="preserve">Chronological Update History</w:t>
+      </w:r>
+    </w:p>
+    <w:p>
+      <w:r/>
+    </w:p>
+    <w:p>
+      <w:pPr>
+        <w:pStyle w:val="Heading3"/>
+      </w:pPr>
+      <w:r>
+        <w:t xml:space="preserve">Phase 29: One-Command Local Startup Pass</w:t>
+      </w:r>
+    </w:p>
+    <w:p>
+      <w:r/>
+    </w:p>
+    <w:p>
+      <w:r>
+        <w:t xml:space="preserve">• Added a root-level one-command development launcher so the project can be started from a single terminal instead of opening separate backend and frontend shells every time.</w:t>
+      </w:r>
+    </w:p>
+    <w:p>
+      <w:r>
+        <w:t xml:space="preserve">• Added a root `package.json` with:</w:t>
+      </w:r>
+    </w:p>
+    <w:p>
+      <w:r>
+        <w:t xml:space="preserve">  - `npm run dev` for the default local startup flow</w:t>
+      </w:r>
+    </w:p>
+    <w:p>
+      <w:r>
+        <w:t xml:space="preserve">  - `npm run dev:ports` as a documented port-override entry point</w:t>
+      </w:r>
+    </w:p>
+    <w:p>
+      <w:r>
+        <w:t xml:space="preserve">  - `npm run stop` to shut both launcher-owned processes down cleanly</w:t>
+      </w:r>
+    </w:p>
+    <w:p>
+      <w:r>
+        <w:t xml:space="preserve">• Added a Windows-friendly PowerShell runner at `scripts/run-dev.ps1`:</w:t>
+      </w:r>
+    </w:p>
+    <w:p>
+      <w:r>
+        <w:t xml:space="preserve">  - checks that backend and frontend directories exist</w:t>
+      </w:r>
+    </w:p>
+    <w:p>
+      <w:r>
+        <w:t xml:space="preserve">  - checks that the backend virtualenv Python exists</w:t>
+      </w:r>
+    </w:p>
+    <w:p>
+      <w:r>
+        <w:t xml:space="preserve">  - locates `npm.cmd`</w:t>
+      </w:r>
+    </w:p>
+    <w:p>
+      <w:r>
+        <w:t xml:space="preserve">  - validates that the requested ports are free before startup</w:t>
+      </w:r>
+    </w:p>
+    <w:p>
+      <w:r>
+        <w:t xml:space="preserve">  - starts FastAPI and Next.js from one root command in the active Windows environment</w:t>
+      </w:r>
+    </w:p>
+    <w:p>
+      <w:r>
+        <w:t xml:space="preserve">  - waits for backend health and frontend HTTP readiness</w:t>
+      </w:r>
+    </w:p>
+    <w:p>
+      <w:r>
+        <w:t xml:space="preserve">  - writes runtime state so the services can be stopped later through one matching command</w:t>
+      </w:r>
+    </w:p>
+    <w:p>
+      <w:r>
+        <w:t xml:space="preserve">• Added `scripts/stop-dev.ps1` so the root launcher has a clear teardown path instead of leaving orphaned development processes behind.</w:t>
+      </w:r>
+    </w:p>
+    <w:p>
+      <w:r>
+        <w:t xml:space="preserve">• Added Git hygiene for local runner artifacts:</w:t>
+      </w:r>
+    </w:p>
+    <w:p>
+      <w:r>
+        <w:t xml:space="preserve">  - `.codex/` is now ignored so local Codex-generated logs and helper runtime files do not pollute Git status before a GitHub push</w:t>
+      </w:r>
+    </w:p>
+    <w:p>
+      <w:r>
+        <w:t xml:space="preserve">  - temporary launcher runtime folders remain ignored as local-only state</w:t>
+      </w:r>
+    </w:p>
+    <w:p>
+      <w:r>
+        <w:t xml:space="preserve">• Updated the top-level `README.md` so the default local run flow is now documented as a single command from the repo root.</w:t>
+      </w:r>
+    </w:p>
+    <w:p>
+      <w:r>
+        <w:t xml:space="preserve">• Preserved the original separate backend/frontend startup commands for debugging and direct service work. This pass adds orchestration convenience without removing the old paths.</w:t>
+      </w:r>
+    </w:p>
+    <w:p>
+      <w:r/>
+    </w:p>
+    <w:p>
+      <w:r>
+        <w:t xml:space="preserve">Technical files changed in this pass:</w:t>
+      </w:r>
+    </w:p>
+    <w:p>
+      <w:r/>
+    </w:p>
+    <w:p>
+      <w:r>
+        <w:t xml:space="preserve">• `package.json`</w:t>
+      </w:r>
+    </w:p>
+    <w:p>
+      <w:r>
+        <w:t xml:space="preserve">• `scripts/run-dev.ps1`</w:t>
+      </w:r>
+    </w:p>
+    <w:p>
+      <w:r>
+        <w:t xml:space="preserve">• `README.md`</w:t>
+      </w:r>
+    </w:p>
+    <w:p>
+      <w:r>
+        <w:t xml:space="preserve">• `docs/APEXAI_MASTER_RECORD.md`</w:t>
+      </w:r>
+    </w:p>
+    <w:p>
+      <w:r>
+        <w:t xml:space="preserve">• `docs/ApexAI_Project_Record.docx`</w:t>
+      </w:r>
+    </w:p>
+    <w:p>
+      <w:r/>
+    </w:p>
+    <w:p>
+      <w:r>
+        <w:t xml:space="preserve">Verification for this pass:</w:t>
+      </w:r>
+    </w:p>
+    <w:p>
+      <w:r/>
+    </w:p>
+    <w:p>
+      <w:r>
+        <w:t xml:space="preserve">• one-command launcher smoke test on alternate ports</w:t>
+      </w:r>
+    </w:p>
+    <w:p>
+      <w:r>
+        <w:t xml:space="preserve">• doc regeneration: `python docs/generate_project_doc.py`</w:t>
+      </w:r>
+    </w:p>
+    <w:p>
+      <w:r/>
+    </w:p>
+    <w:p>
+      <w:r>
+        <w:t xml:space="preserve">Known notes:</w:t>
+      </w:r>
+    </w:p>
+    <w:p>
+      <w:r/>
+    </w:p>
+    <w:p>
+      <w:r>
+        <w:t xml:space="preserve">• The new root launcher is designed around the current Windows development environment because that is the active project setup.</w:t>
+      </w:r>
+    </w:p>
+    <w:p>
+      <w:r/>
+    </w:p>
+    <w:p>
+      <w:pPr>
+        <w:pStyle w:val="Heading3"/>
+      </w:pPr>
+      <w:r>
+        <w:t xml:space="preserve">Phase 28: Driver Compare Analytics Deepening Pass</w:t>
+      </w:r>
+    </w:p>
+    <w:p>
+      <w:r/>
+    </w:p>
+    <w:p>
+      <w:r>
+        <w:t xml:space="preserve">• Extended the Driver Compare feature without changing its existing FastF1-backed request flow, lap selection model, or prior comparison blocks.</w:t>
+      </w:r>
+    </w:p>
+    <w:p>
+      <w:r>
+        <w:t xml:space="preserve">• Added a richer session-analysis layer at the top of compare:</w:t>
+      </w:r>
+    </w:p>
+    <w:p>
+      <w:r>
+        <w:t xml:space="preserve">  - session summary now appears directly inside the compare verdict area</w:t>
+      </w:r>
+    </w:p>
+    <w:p>
+      <w:r>
+        <w:t xml:space="preserve">  - weather and backend insight lines are surfaced so users can read the lap comparison in weekend context instead of as isolated numbers</w:t>
+      </w:r>
+    </w:p>
+    <w:p>
+      <w:r>
+        <w:t xml:space="preserve">• Added compare-specific coaching summaries using backend `performance` data:</w:t>
+      </w:r>
+    </w:p>
+    <w:p>
+      <w:r>
+        <w:t xml:space="preserve">  - benchmark summary</w:t>
+      </w:r>
+    </w:p>
+    <w:p>
+      <w:r>
+        <w:t xml:space="preserve">  - coaching focus</w:t>
+      </w:r>
+    </w:p>
+    <w:p>
+      <w:r>
+        <w:t xml:space="preserve">  - braking style</w:t>
+      </w:r>
+    </w:p>
+    <w:p>
+      <w:r>
+        <w:t xml:space="preserve">  - throttle style</w:t>
+      </w:r>
+    </w:p>
+    <w:p>
+      <w:r>
+        <w:t xml:space="preserve">  - corner profile</w:t>
+      </w:r>
+    </w:p>
+    <w:p>
+      <w:r>
+        <w:t xml:space="preserve">  - consistency score</w:t>
+      </w:r>
+    </w:p>
+    <w:p>
+      <w:r>
+        <w:t xml:space="preserve">  - mistake flags when the backend detects an execution signature</w:t>
+      </w:r>
+    </w:p>
+    <w:p>
+      <w:r>
+        <w:t xml:space="preserve">• Added a micro-sector swing section using backend `micro_sectors`:</w:t>
+      </w:r>
+    </w:p>
+    <w:p>
+      <w:r>
+        <w:t xml:space="preserve">  - counts how many micro-sectors each selected lap leads</w:t>
+      </w:r>
+    </w:p>
+    <w:p>
+      <w:r>
+        <w:t xml:space="preserve">  - highlights the biggest gain and biggest loss zone</w:t>
+      </w:r>
+    </w:p>
+    <w:p>
+      <w:r>
+        <w:t xml:space="preserve">  - lists segment distance ranges and corner-type tags so users can localize the pace difference more precisely</w:t>
+      </w:r>
+    </w:p>
+    <w:p>
+      <w:r>
+        <w:t xml:space="preserve">• Added a full trace-analysis layer to Driver Compare using the existing telemetry components:</w:t>
+      </w:r>
+    </w:p>
+    <w:p>
+      <w:r>
+        <w:t xml:space="preserve">  - synced speed, throttle, brake, steering, gear, RPM, and delta traces can now be shown directly inside compare</w:t>
+      </w:r>
+    </w:p>
+    <w:p>
+      <w:r>
+        <w:t xml:space="preserve">  - compare now includes a shared inspection window with zoom, pan, range sliders, drag-to-zoom, and a live cursor</w:t>
+      </w:r>
+    </w:p>
+    <w:p>
+      <w:r>
+        <w:t xml:space="preserve">  - compare now includes the backend track map and corner focus controls so the charts can be read in circuit context</w:t>
+      </w:r>
+    </w:p>
+    <w:p>
+      <w:r>
+        <w:t xml:space="preserve">  - all of this remains tied to the same selected FastF1 laps rather than any hardcoded compare dataset</w:t>
+      </w:r>
+    </w:p>
+    <w:p>
+      <w:r>
+        <w:t xml:space="preserve">• Expanded compare ranking readability:</w:t>
+      </w:r>
+    </w:p>
+    <w:p>
+      <w:r>
+        <w:t xml:space="preserve">  - benchmark rank cards now include lap delta to best</w:t>
+      </w:r>
+    </w:p>
+    <w:p>
+      <w:r>
+        <w:t xml:space="preserve">  - backend ranking summary text is shown directly in compare</w:t>
+      </w:r>
+    </w:p>
+    <w:p>
+      <w:r>
+        <w:t xml:space="preserve">  - backend main-loss corner context is surfaced when available</w:t>
+      </w:r>
+    </w:p>
+    <w:p>
+      <w:r>
+        <w:t xml:space="preserve">• Improved corner interpretation and naming on the compare page:</w:t>
+      </w:r>
+    </w:p>
+    <w:p>
+      <w:r>
+        <w:t xml:space="preserve">  - compare rows now prefer backend human-readable corner labels</w:t>
+      </w:r>
+    </w:p>
+    <w:p>
+      <w:r>
+        <w:t xml:space="preserve">  - official corner names are carried through when available</w:t>
+      </w:r>
+    </w:p>
+    <w:p>
+      <w:r>
+        <w:t xml:space="preserve">  - confidence percentage and segmentation quality are visible in the compare corner review</w:t>
+      </w:r>
+    </w:p>
+    <w:p>
+      <w:r>
+        <w:t xml:space="preserve">  - corner hints are surfaced so the analysis reads more like engineering notes and less like a raw table</w:t>
+      </w:r>
+    </w:p>
+    <w:p>
+      <w:r>
+        <w:t xml:space="preserve">• Added a compare-specific corner trust layer:</w:t>
+      </w:r>
+    </w:p>
+    <w:p>
+      <w:r>
+        <w:t xml:space="preserve">  - users can see which backend corner detections are low confidence</w:t>
+      </w:r>
+    </w:p>
+    <w:p>
+      <w:r>
+        <w:t xml:space="preserve">  - the page now explains how to treat those corners as directional rather than final truth</w:t>
+      </w:r>
+    </w:p>
+    <w:p>
+      <w:r>
+        <w:t xml:space="preserve">• Removed a stale unused reverse-pair variable from the compare page while keeping all existing compare behavior intact.</w:t>
+      </w:r>
+    </w:p>
+    <w:p>
+      <w:r/>
+    </w:p>
+    <w:p>
+      <w:r>
+        <w:t xml:space="preserve">Technical files changed in this pass:</w:t>
+      </w:r>
+    </w:p>
+    <w:p>
+      <w:r/>
+    </w:p>
+    <w:p>
+      <w:r>
+        <w:t xml:space="preserve">• `frontend/src/app/compare/page.tsx`</w:t>
+      </w:r>
+    </w:p>
+    <w:p>
+      <w:r>
+        <w:t xml:space="preserve">• `docs/APEXAI_MASTER_RECORD.md`</w:t>
+      </w:r>
+    </w:p>
+    <w:p>
+      <w:r>
+        <w:t xml:space="preserve">• `docs/ApexAI_Project_Record.docx`</w:t>
+      </w:r>
+    </w:p>
+    <w:p>
+      <w:r/>
+    </w:p>
+    <w:p>
+      <w:r>
+        <w:t xml:space="preserve">Verification for this pass:</w:t>
+      </w:r>
+    </w:p>
+    <w:p>
+      <w:r/>
+    </w:p>
+    <w:p>
+      <w:r>
+        <w:t xml:space="preserve">• frontend production build: `npm run build`</w:t>
+      </w:r>
+    </w:p>
+    <w:p>
+      <w:r>
+        <w:t xml:space="preserve">• doc regeneration: `python docs/generate_project_doc.py`</w:t>
+      </w:r>
+    </w:p>
+    <w:p>
+      <w:r/>
+    </w:p>
+    <w:p>
+      <w:r>
+        <w:t xml:space="preserve">Known notes:</w:t>
+      </w:r>
+    </w:p>
+    <w:p>
+      <w:r/>
+    </w:p>
+    <w:p>
+      <w:r>
+        <w:t xml:space="preserve">• This pass intentionally improves analytical depth and readability without attempting the larger compare-page visual decluttering pass that is still planned for later frontend work.</w:t>
       </w:r>
     </w:p>
     <w:p>

</xml_diff>